<commit_message>
+presentación proyecto +juego exportado
</commit_message>
<xml_diff>
--- a/Fase 2/Evidencias Grupales/2.6_GuiaEstudiante_Fase 2_Informe Final Proyecto APT.docx
+++ b/Fase 2/Evidencias Grupales/2.6_GuiaEstudiante_Fase 2_Informe Final Proyecto APT.docx
@@ -1001,27 +1001,7 @@
                 <w:sz w:val="20"/>
                 <w:szCs w:val="20"/>
               </w:rPr>
-              <w:t xml:space="preserve">La relevancia de este tema para nuestra carrera radica en que, si bien la tecnología es parte del problema, también puede transformarse en la herramienta clave para diseñar soluciones que favorezcan un desarrollo sano y consciente en los infantes. En un inicio, la propuesta estará orientada a la comunidad hispanohablante, pero con la proyección de escalar hacia un alcance global. Asimismo, se busca que este proyecto tenga un impacto positivo en familias de bajos recursos, </w:t>
-            </w:r>
-            <w:proofErr w:type="gramStart"/>
-            <w:r>
-              <w:rPr>
-                <w:i/>
-                <w:color w:val="548DD4"/>
-                <w:sz w:val="20"/>
-                <w:szCs w:val="20"/>
-              </w:rPr>
-              <w:t>ya que</w:t>
-            </w:r>
-            <w:proofErr w:type="gramEnd"/>
-            <w:r>
-              <w:rPr>
-                <w:i/>
-                <w:color w:val="548DD4"/>
-                <w:sz w:val="20"/>
-                <w:szCs w:val="20"/>
-              </w:rPr>
-              <w:t xml:space="preserve"> en lugar de invertir en materiales físicos costosos, podrían acceder de manera gratuita a </w:t>
+              <w:t xml:space="preserve">La relevancia de este tema para nuestra carrera radica en que, si bien la tecnología es parte del problema, también puede transformarse en la herramienta clave para diseñar soluciones que favorezcan un desarrollo sano y consciente en los infantes. En un inicio, la propuesta estará orientada a la comunidad hispanohablante, pero con la proyección de escalar hacia un alcance global. Asimismo, se busca que este proyecto tenga un impacto positivo en familias de bajos recursos, ya que en lugar de invertir en materiales físicos costosos, podrían acceder de manera gratuita a </w:t>
             </w:r>
             <w:r>
               <w:rPr>
@@ -1736,31 +1716,7 @@
                 <w:szCs w:val="20"/>
                 <w:lang w:eastAsia="es-CL"/>
               </w:rPr>
-              <w:t xml:space="preserve">Definición de estilo </w:t>
-            </w:r>
-            <w:proofErr w:type="gramStart"/>
-            <w:r>
-              <w:rPr>
-                <w:rFonts w:ascii="Calibri" w:hAnsi="Calibri" w:cs="Arial"/>
-                <w:i/>
-                <w:color w:val="0070C0"/>
-                <w:sz w:val="18"/>
-                <w:szCs w:val="20"/>
-                <w:lang w:eastAsia="es-CL"/>
-              </w:rPr>
-              <w:t>pixel</w:t>
-            </w:r>
-            <w:proofErr w:type="gramEnd"/>
-            <w:r>
-              <w:rPr>
-                <w:rFonts w:ascii="Calibri" w:hAnsi="Calibri" w:cs="Arial"/>
-                <w:i/>
-                <w:color w:val="0070C0"/>
-                <w:sz w:val="18"/>
-                <w:szCs w:val="20"/>
-                <w:lang w:eastAsia="es-CL"/>
-              </w:rPr>
-              <w:t>-art.</w:t>
+              <w:t>Definición de estilo pixel-art.</w:t>
             </w:r>
           </w:p>
           <w:p>
@@ -2052,6 +2008,19 @@
           </w:p>
           <w:p>
             <w:pPr>
+              <w:jc w:val="both"/>
+              <w:rPr>
+                <w:rFonts w:ascii="Calibri" w:hAnsi="Calibri" w:cs="Arial"/>
+                <w:i/>
+                <w:color w:val="0070C0"/>
+                <w:sz w:val="18"/>
+                <w:szCs w:val="20"/>
+                <w:lang w:eastAsia="es-CL"/>
+              </w:rPr>
+            </w:pPr>
+          </w:p>
+          <w:p>
+            <w:pPr>
               <w:numPr>
                 <w:ilvl w:val="0"/>
                 <w:numId w:val="8"/>
@@ -2077,7 +2046,6 @@
                 <w:szCs w:val="20"/>
                 <w:lang w:eastAsia="es-CL"/>
               </w:rPr>
-              <w:lastRenderedPageBreak/>
               <w:t>Integración final y pruebas:</w:t>
             </w:r>
           </w:p>
@@ -2797,27 +2765,7 @@
                   <w:szCs w:val="20"/>
                   <w:u w:val="single"/>
                 </w:rPr>
-                <w:t>Ejecutable primer min</w:t>
-              </w:r>
-              <w:r>
-                <w:rPr>
-                  <w:i/>
-                  <w:color w:val="1155CC"/>
-                  <w:sz w:val="20"/>
-                  <w:szCs w:val="20"/>
-                  <w:u w:val="single"/>
-                </w:rPr>
-                <w:t>i</w:t>
-              </w:r>
-              <w:r>
-                <w:rPr>
-                  <w:i/>
-                  <w:color w:val="1155CC"/>
-                  <w:sz w:val="20"/>
-                  <w:szCs w:val="20"/>
-                  <w:u w:val="single"/>
-                </w:rPr>
-                <w:t>juego</w:t>
+                <w:t>Ejecutable primer minijuego</w:t>
               </w:r>
             </w:hyperlink>
             <w:r>
@@ -2934,27 +2882,7 @@
                   <w:szCs w:val="20"/>
                   <w:u w:val="single"/>
                 </w:rPr>
-                <w:t>Documentación historias de usua</w:t>
-              </w:r>
-              <w:r>
-                <w:rPr>
-                  <w:i/>
-                  <w:color w:val="1155CC"/>
-                  <w:sz w:val="20"/>
-                  <w:szCs w:val="20"/>
-                  <w:u w:val="single"/>
-                </w:rPr>
-                <w:t>r</w:t>
-              </w:r>
-              <w:r>
-                <w:rPr>
-                  <w:i/>
-                  <w:color w:val="1155CC"/>
-                  <w:sz w:val="20"/>
-                  <w:szCs w:val="20"/>
-                  <w:u w:val="single"/>
-                </w:rPr>
-                <w:t xml:space="preserve">io, backlogs, </w:t>
+                <w:t xml:space="preserve">Documentación historias de usuario, backlogs, </w:t>
               </w:r>
               <w:proofErr w:type="spellStart"/>
               <w:r>
@@ -2998,7 +2926,7 @@
                 <w:sz w:val="20"/>
                 <w:szCs w:val="20"/>
               </w:rPr>
-              <w:t>–</w:t>
+              <w:t xml:space="preserve">– </w:t>
             </w:r>
             <w:r>
               <w:rPr>
@@ -3008,16 +2936,6 @@
                 <w:sz w:val="20"/>
                 <w:szCs w:val="20"/>
               </w:rPr>
-              <w:t xml:space="preserve"> </w:t>
-            </w:r>
-            <w:r>
-              <w:rPr>
-                <w:b/>
-                <w:i/>
-                <w:color w:val="548DD4"/>
-                <w:sz w:val="20"/>
-                <w:szCs w:val="20"/>
-              </w:rPr>
               <w:t>Documento de Épicas e Historias de Usuario</w:t>
             </w:r>
           </w:p>
@@ -3055,15 +2973,6 @@
           <w:p>
             <w:pPr>
               <w:spacing w:after="0" w:line="240" w:lineRule="auto"/>
-              <w:rPr>
-                <w:rFonts w:ascii="Calibri" w:hAnsi="Calibri" w:cs="Calibri"/>
-                <w:b/>
-                <w:i/>
-                <w:iCs/>
-                <w:color w:val="4472C4" w:themeColor="accent1"/>
-                <w:sz w:val="18"/>
-                <w:szCs w:val="18"/>
-              </w:rPr>
             </w:pPr>
             <w:hyperlink r:id="rId15" w:history="1">
               <w:r>
@@ -3077,59 +2986,7 @@
                   <w:sz w:val="18"/>
                   <w:szCs w:val="18"/>
                 </w:rPr>
-                <w:t>Documento de</w:t>
-              </w:r>
-              <w:r>
-                <w:rPr>
-                  <w:rStyle w:val="Hipervnculo"/>
-                  <w:rFonts w:ascii="Calibri" w:hAnsi="Calibri" w:cs="Calibri"/>
-                  <w:b/>
-                  <w:i/>
-                  <w:iCs/>
-                  <w:color w:val="4472C4" w:themeColor="accent1"/>
-                  <w:sz w:val="18"/>
-                  <w:szCs w:val="18"/>
-                </w:rPr>
-                <w:t xml:space="preserve"> </w:t>
-              </w:r>
-              <w:r>
-                <w:rPr>
-                  <w:rStyle w:val="Hipervnculo"/>
-                  <w:rFonts w:ascii="Calibri" w:hAnsi="Calibri" w:cs="Calibri"/>
-                  <w:b/>
-                  <w:i/>
-                  <w:iCs/>
-                  <w:color w:val="4472C4" w:themeColor="accent1"/>
-                  <w:sz w:val="18"/>
-                  <w:szCs w:val="18"/>
-                </w:rPr>
-                <w:t xml:space="preserve">Épicas e Historias de </w:t>
-              </w:r>
-              <w:r>
-                <w:rPr>
-                  <w:rStyle w:val="Hipervnculo"/>
-                  <w:rFonts w:ascii="Calibri" w:hAnsi="Calibri" w:cs="Calibri"/>
-                  <w:b/>
-                  <w:i/>
-                  <w:iCs/>
-                  <w:color w:val="4472C4" w:themeColor="accent1"/>
-                  <w:sz w:val="18"/>
-                  <w:szCs w:val="18"/>
-                </w:rPr>
-                <w:t>U</w:t>
-              </w:r>
-              <w:r>
-                <w:rPr>
-                  <w:rStyle w:val="Hipervnculo"/>
-                  <w:rFonts w:ascii="Calibri" w:hAnsi="Calibri" w:cs="Calibri"/>
-                  <w:b/>
-                  <w:i/>
-                  <w:iCs/>
-                  <w:color w:val="4472C4" w:themeColor="accent1"/>
-                  <w:sz w:val="18"/>
-                  <w:szCs w:val="18"/>
-                </w:rPr>
-                <w:t>suario</w:t>
+                <w:t>Documento de Épicas e Historias de Usuario</w:t>
               </w:r>
             </w:hyperlink>
           </w:p>
@@ -3137,15 +2994,127 @@
             <w:pPr>
               <w:spacing w:after="0" w:line="240" w:lineRule="auto"/>
               <w:rPr>
-                <w:rFonts w:ascii="Calibri" w:hAnsi="Calibri" w:cs="Calibri"/>
                 <w:b/>
-                <w:i/>
                 <w:iCs/>
-                <w:color w:val="4472C4" w:themeColor="accent1"/>
-                <w:sz w:val="18"/>
-                <w:szCs w:val="18"/>
-              </w:rPr>
-            </w:pPr>
+              </w:rPr>
+            </w:pPr>
+          </w:p>
+          <w:p>
+            <w:pPr>
+              <w:rPr>
+                <w:b/>
+                <w:i/>
+                <w:color w:val="548DD4"/>
+                <w:sz w:val="20"/>
+                <w:szCs w:val="20"/>
+              </w:rPr>
+            </w:pPr>
+            <w:r>
+              <w:rPr>
+                <w:b/>
+                <w:i/>
+                <w:color w:val="0070C0"/>
+                <w:sz w:val="20"/>
+                <w:szCs w:val="24"/>
+              </w:rPr>
+              <w:lastRenderedPageBreak/>
+              <w:t xml:space="preserve">Evidencia </w:t>
+            </w:r>
+            <w:r>
+              <w:rPr>
+                <w:b/>
+                <w:i/>
+                <w:color w:val="0070C0"/>
+                <w:sz w:val="20"/>
+                <w:szCs w:val="24"/>
+              </w:rPr>
+              <w:t>5</w:t>
+            </w:r>
+            <w:r>
+              <w:rPr>
+                <w:b/>
+                <w:i/>
+                <w:color w:val="0070C0"/>
+                <w:sz w:val="20"/>
+                <w:szCs w:val="24"/>
+              </w:rPr>
+              <w:t xml:space="preserve"> </w:t>
+            </w:r>
+            <w:r>
+              <w:rPr>
+                <w:b/>
+                <w:i/>
+                <w:color w:val="548DD4"/>
+                <w:sz w:val="20"/>
+                <w:szCs w:val="20"/>
+              </w:rPr>
+              <w:t xml:space="preserve">– </w:t>
+            </w:r>
+            <w:proofErr w:type="spellStart"/>
+            <w:r>
+              <w:rPr>
+                <w:b/>
+                <w:i/>
+                <w:color w:val="548DD4"/>
+                <w:sz w:val="20"/>
+                <w:szCs w:val="20"/>
+              </w:rPr>
+              <w:t>Version</w:t>
+            </w:r>
+            <w:proofErr w:type="spellEnd"/>
+            <w:r>
+              <w:rPr>
+                <w:b/>
+                <w:i/>
+                <w:color w:val="548DD4"/>
+                <w:sz w:val="20"/>
+                <w:szCs w:val="20"/>
+              </w:rPr>
+              <w:t xml:space="preserve"> 1.0 Juego terminado (.exe y .</w:t>
+            </w:r>
+            <w:proofErr w:type="spellStart"/>
+            <w:r>
+              <w:rPr>
+                <w:b/>
+                <w:i/>
+                <w:color w:val="548DD4"/>
+                <w:sz w:val="20"/>
+                <w:szCs w:val="20"/>
+              </w:rPr>
+              <w:t>apk</w:t>
+            </w:r>
+            <w:proofErr w:type="spellEnd"/>
+            <w:r>
+              <w:rPr>
+                <w:b/>
+                <w:i/>
+                <w:color w:val="548DD4"/>
+                <w:sz w:val="20"/>
+                <w:szCs w:val="20"/>
+              </w:rPr>
+              <w:t>)</w:t>
+            </w:r>
+          </w:p>
+          <w:p>
+            <w:pPr>
+              <w:rPr>
+                <w:bCs/>
+                <w:i/>
+                <w:color w:val="548DD4"/>
+                <w:sz w:val="20"/>
+                <w:szCs w:val="20"/>
+              </w:rPr>
+            </w:pPr>
+            <w:r>
+              <w:rPr>
+                <w:bCs/>
+                <w:i/>
+                <w:color w:val="548DD4"/>
+                <w:sz w:val="20"/>
+                <w:szCs w:val="20"/>
+              </w:rPr>
+              <w:t>Primera versión jugable con todos los minijuegos implementados, justo a los menús interactivos y adaptado para el público objetivo.</w:t>
+            </w:r>
           </w:p>
           <w:p>
             <w:pPr>
@@ -6048,7 +6017,7 @@
   <w:style w:type="paragraph" w:default="1" w:styleId="Normal">
     <w:name w:val="Normal"/>
     <w:qFormat/>
-    <w:rsid w:val="00E07275"/>
+    <w:rsid w:val="00561411"/>
     <w:pPr>
       <w:spacing w:after="160" w:line="259" w:lineRule="auto"/>
     </w:pPr>
@@ -6105,6 +6074,7 @@
   <w:style w:type="character" w:default="1" w:styleId="Fuentedeprrafopredeter">
     <w:name w:val="Default Paragraph Font"/>
     <w:uiPriority w:val="1"/>
+    <w:semiHidden/>
     <w:unhideWhenUsed/>
   </w:style>
   <w:style w:type="table" w:default="1" w:styleId="Tablanormal">
@@ -6752,19 +6722,12 @@
 </file>
 
 <file path=customXml/item1.xml><?xml version="1.0" encoding="utf-8"?>
-<?mso-contentType ?>
-<FormTemplates xmlns="http://schemas.microsoft.com/sharepoint/v3/contenttype/forms">
-  <Display>DocumentLibraryForm</Display>
-  <Edit>DocumentLibraryForm</Edit>
-  <New>DocumentLibraryForm</New>
-</FormTemplates>
+<p:properties xmlns:p="http://schemas.microsoft.com/office/2006/metadata/properties" xmlns:xsi="http://www.w3.org/2001/XMLSchema-instance" xmlns:pc="http://schemas.microsoft.com/office/infopath/2007/PartnerControls">
+  <documentManagement/>
+</p:properties>
 </file>
 
 <file path=customXml/item2.xml><?xml version="1.0" encoding="utf-8"?>
-<b:Sources xmlns:b="http://schemas.openxmlformats.org/officeDocument/2006/bibliography" xmlns="http://schemas.openxmlformats.org/officeDocument/2006/bibliography" SelectedStyle="\APASixthEditionOfficeOnline.xsl" StyleName="APA" Version="6"/>
-</file>
-
-<file path=customXml/item3.xml><?xml version="1.0" encoding="utf-8"?>
 <ct:contentTypeSchema xmlns:ct="http://schemas.microsoft.com/office/2006/metadata/contentType" xmlns:ma="http://schemas.microsoft.com/office/2006/metadata/properties/metaAttributes" ct:_="" ma:_="" ma:contentTypeName="Documento" ma:contentTypeID="0x010100E96778489EE7714D8BD12CC105EB918B" ma:contentTypeVersion="2" ma:contentTypeDescription="Crear nuevo documento." ma:contentTypeScope="" ma:versionID="416c5c7ae9b5d54d83875cd3c65194e3">
   <xsd:schema xmlns:xsd="http://www.w3.org/2001/XMLSchema" xmlns:xs="http://www.w3.org/2001/XMLSchema" xmlns:p="http://schemas.microsoft.com/office/2006/metadata/properties" xmlns:ns2="126e8a1c-9ea9-435a-ac89-d06c80d62e30" targetNamespace="http://schemas.microsoft.com/office/2006/metadata/properties" ma:root="true" ma:fieldsID="70a237c842677bd850644f8595079f5e" ns2:_="">
     <xsd:import namespace="126e8a1c-9ea9-435a-ac89-d06c80d62e30"/>
@@ -6896,29 +6859,29 @@
 </ct:contentTypeSchema>
 </file>
 
+<file path=customXml/item3.xml><?xml version="1.0" encoding="utf-8"?>
+<b:Sources xmlns:b="http://schemas.openxmlformats.org/officeDocument/2006/bibliography" xmlns="http://schemas.openxmlformats.org/officeDocument/2006/bibliography" SelectedStyle="\APASixthEditionOfficeOnline.xsl" StyleName="APA" Version="6"/>
+</file>
+
 <file path=customXml/item4.xml><?xml version="1.0" encoding="utf-8"?>
-<p:properties xmlns:p="http://schemas.microsoft.com/office/2006/metadata/properties" xmlns:xsi="http://www.w3.org/2001/XMLSchema-instance" xmlns:pc="http://schemas.microsoft.com/office/infopath/2007/PartnerControls">
-  <documentManagement/>
-</p:properties>
+<?mso-contentType ?>
+<FormTemplates xmlns="http://schemas.microsoft.com/sharepoint/v3/contenttype/forms">
+  <Display>DocumentLibraryForm</Display>
+  <Edit>DocumentLibraryForm</Edit>
+  <New>DocumentLibraryForm</New>
+</FormTemplates>
 </file>
 
 <file path=customXml/itemProps1.xml><?xml version="1.0" encoding="utf-8"?>
-<ds:datastoreItem xmlns:ds="http://schemas.openxmlformats.org/officeDocument/2006/customXml" ds:itemID="{DB26575A-B7B3-4412-B642-D3B0845180CC}">
+<ds:datastoreItem xmlns:ds="http://schemas.openxmlformats.org/officeDocument/2006/customXml" ds:itemID="{372B79FC-6971-4544-98C5-83069028712A}">
   <ds:schemaRefs>
-    <ds:schemaRef ds:uri="http://schemas.microsoft.com/sharepoint/v3/contenttype/forms"/>
+    <ds:schemaRef ds:uri="http://schemas.microsoft.com/office/2006/metadata/properties"/>
+    <ds:schemaRef ds:uri="http://schemas.microsoft.com/office/infopath/2007/PartnerControls"/>
   </ds:schemaRefs>
 </ds:datastoreItem>
 </file>
 
 <file path=customXml/itemProps2.xml><?xml version="1.0" encoding="utf-8"?>
-<ds:datastoreItem xmlns:ds="http://schemas.openxmlformats.org/officeDocument/2006/customXml" ds:itemID="{BDCED711-E314-4C22-B587-D275DD8897EC}">
-  <ds:schemaRefs>
-    <ds:schemaRef ds:uri="http://schemas.openxmlformats.org/officeDocument/2006/bibliography"/>
-  </ds:schemaRefs>
-</ds:datastoreItem>
-</file>
-
-<file path=customXml/itemProps3.xml><?xml version="1.0" encoding="utf-8"?>
 <ds:datastoreItem xmlns:ds="http://schemas.openxmlformats.org/officeDocument/2006/customXml" ds:itemID="{1A4E63CB-0BBC-477D-B96D-0B1E89CFECED}">
   <ds:schemaRefs>
     <ds:schemaRef ds:uri="http://schemas.microsoft.com/office/2006/metadata/contentType"/>
@@ -6936,11 +6899,18 @@
 </ds:datastoreItem>
 </file>
 
+<file path=customXml/itemProps3.xml><?xml version="1.0" encoding="utf-8"?>
+<ds:datastoreItem xmlns:ds="http://schemas.openxmlformats.org/officeDocument/2006/customXml" ds:itemID="{BDCED711-E314-4C22-B587-D275DD8897EC}">
+  <ds:schemaRefs>
+    <ds:schemaRef ds:uri="http://schemas.openxmlformats.org/officeDocument/2006/bibliography"/>
+  </ds:schemaRefs>
+</ds:datastoreItem>
+</file>
+
 <file path=customXml/itemProps4.xml><?xml version="1.0" encoding="utf-8"?>
-<ds:datastoreItem xmlns:ds="http://schemas.openxmlformats.org/officeDocument/2006/customXml" ds:itemID="{372B79FC-6971-4544-98C5-83069028712A}">
+<ds:datastoreItem xmlns:ds="http://schemas.openxmlformats.org/officeDocument/2006/customXml" ds:itemID="{DB26575A-B7B3-4412-B642-D3B0845180CC}">
   <ds:schemaRefs>
-    <ds:schemaRef ds:uri="http://schemas.microsoft.com/office/2006/metadata/properties"/>
-    <ds:schemaRef ds:uri="http://schemas.microsoft.com/office/infopath/2007/PartnerControls"/>
+    <ds:schemaRef ds:uri="http://schemas.microsoft.com/sharepoint/v3/contenttype/forms"/>
   </ds:schemaRefs>
 </ds:datastoreItem>
 </file>
</xml_diff>